<commit_message>
Add CIDR / IP address planner tab with utilization view
New 🧮 CIDR tab (cidr.py, stdlib ipaddress) with four modes:
- Allocate: carve a supernet (IPAM pool) into per-VPC and per-subnet blocks and
  show CLEARLY how the address space is utilized — a treemap (supernet → VPCs →
  subnets with explicit free/unallocated blocks), utilization metrics (supernet
  %, per-VPC %, total AWS-usable hosts with 5 IPs/subnet reserved), a per-subnet
  usable-host table, and CSV export. Defaults VPC count to the design's workloads.
- Overlap check: detect colliding CIDRs across accounts/datacenters (M&A pitfall),
  pre-filled with a Company A/B example.
- Inspect: full breakdown of one CIDR (usable + AWS-usable hosts).
- Subdivide: split a CIDR into equal /N subnets.

Guide + technical manual updated. Boots clean.

Co-Authored-By: Claude Opus 4.8 (1M context) <noreply@anthropic.com>
</commit_message>
<xml_diff>
--- a/AWS_Landing_Zone_Studio_Technical_Manual.docx
+++ b/AWS_Landing_Zone_Studio_Technical_Manual.docx
@@ -430,6 +430,36 @@
                 <w:sz w:val="19"/>
               </w:rPr>
               <w:t>In-app user guide: quick start, per-tab how-to, workflows, FAQ</w:t>
+            </w:r>
+          </w:p>
+        </w:tc>
+      </w:tr>
+      <w:tr>
+        <w:tc>
+          <w:tcPr>
+            <w:tcW w:type="dxa" w:w="2304"/>
+          </w:tcPr>
+          <w:p>
+            <w:r/>
+            <w:r>
+              <w:rPr>
+                <w:sz w:val="19"/>
+              </w:rPr>
+              <w:t>CIDR</w:t>
+            </w:r>
+          </w:p>
+        </w:tc>
+        <w:tc>
+          <w:tcPr>
+            <w:tcW w:type="dxa" w:w="6624"/>
+          </w:tcPr>
+          <w:p>
+            <w:r/>
+            <w:r>
+              <w:rPr>
+                <w:sz w:val="19"/>
+              </w:rPr>
+              <w:t>IP address planner: allocate supernet→VPC→subnet with a utilization treemap, overlap check, inspect, subdivide</w:t>
             </w:r>
           </w:p>
         </w:tc>

</xml_diff>

<commit_message>
Fix AWS-icon view: rename local diagrams.py -> gv_diagrams.py (name collision with the diagrams library)
The app's own diagrams.py (Graphviz builders) shadowed the mingrammer 'diagrams'
icon library, so 'from diagrams import Diagram' imported the wrong module and the
AWS-icon view always fell back. Rename the local module to gv_diagrams.py and
update app.py's import; the icon library is now reachable and renders on the
server (packages.txt provides the Graphviz binary). Manual updated.

Co-Authored-By: Claude Opus 4.8 (1M context) <noreply@anthropic.com>
</commit_message>
<xml_diff>
--- a/AWS_Landing_Zone_Studio_Technical_Manual.docx
+++ b/AWS_Landing_Zone_Studio_Technical_Manual.docx
@@ -1714,7 +1714,7 @@
               <w:rPr>
                 <w:sz w:val="19"/>
               </w:rPr>
-              <w:t>diagrams.py</w:t>
+              <w:t>gv_diagrams.py</w:t>
             </w:r>
           </w:p>
         </w:tc>
@@ -1728,7 +1728,7 @@
               <w:rPr>
                 <w:sz w:val="19"/>
               </w:rPr>
-              <w:t>Graphviz builders for org structure + network topology</w:t>
+              <w:t>Graphviz builders for org structure + network topology (renamed to free the 'diagrams' name for the icon library)</w:t>
             </w:r>
           </w:p>
         </w:tc>

</xml_diff>

<commit_message>
Add animated two-region end-state architecture diagram
arch_diagram.py renders a detailed hand-laid SVG of the full hybrid end state
across us-east-1 + us-west-2 with every component the customer asked for:
on-prem datacenter + branches, Direct Connect (+ DX Gateway), Site-to-Site VPN
backup, per-region Transit Gateway with inter-region peering, AWS Network
Firewall (inspection), centralized NAT/egress, SD-WAN appliances, the Security
and Shared-Services accounts, and the Prod/Stage/Dev workload VPCs with
public/app/db subnets (real CIDRs per region). Traffic flow is animated via
flowing stroke-dash + moving packets, with a legend (DX / TGW peering /
inspection / egress / VPN / SD-WAN).

Wired into the M&A Integration playbook via st.components.v1.html, with an HTML
download. Manual updated.

Verified: SVG generates (both regions, firewall, VPN, peering, animateMotion);
app boots clean.

Co-Authored-By: Claude Opus 4.8 (1M context) <noreply@anthropic.com>
</commit_message>
<xml_diff>
--- a/AWS_Landing_Zone_Studio_Technical_Manual.docx
+++ b/AWS_Landing_Zone_Studio_Technical_Manual.docx
@@ -1669,6 +1669,66 @@
                 <w:sz w:val="19"/>
               </w:rPr>
               <w:t>Encode/decode a design to a URL-safe shareable token</w:t>
+            </w:r>
+          </w:p>
+        </w:tc>
+      </w:tr>
+      <w:tr>
+        <w:tc>
+          <w:tcPr>
+            <w:tcW w:type="dxa" w:w="2448"/>
+          </w:tcPr>
+          <w:p>
+            <w:r/>
+            <w:r>
+              <w:rPr>
+                <w:sz w:val="19"/>
+              </w:rPr>
+              <w:t>arch_diagram.py</w:t>
+            </w:r>
+          </w:p>
+        </w:tc>
+        <w:tc>
+          <w:tcPr>
+            <w:tcW w:type="dxa" w:w="6480"/>
+          </w:tcPr>
+          <w:p>
+            <w:r/>
+            <w:r>
+              <w:rPr>
+                <w:sz w:val="19"/>
+              </w:rPr>
+              <w:t>Animated two-region end-state architecture (hand-laid SVG with flowing-traffic animation)</w:t>
+            </w:r>
+          </w:p>
+        </w:tc>
+      </w:tr>
+      <w:tr>
+        <w:tc>
+          <w:tcPr>
+            <w:tcW w:type="dxa" w:w="2448"/>
+          </w:tcPr>
+          <w:p>
+            <w:r/>
+            <w:r>
+              <w:rPr>
+                <w:sz w:val="19"/>
+              </w:rPr>
+              <w:t>checklists.py</w:t>
+            </w:r>
+          </w:p>
+        </w:tc>
+        <w:tc>
+          <w:tcPr>
+            <w:tcW w:type="dxa" w:w="6480"/>
+          </w:tcPr>
+          <w:p>
+            <w:r/>
+            <w:r>
+              <w:rPr>
+                <w:sz w:val="19"/>
+              </w:rPr>
+              <w:t>Trackable project-plan checklists + critical-path timelines + master plan export</w:t>
             </w:r>
           </w:p>
         </w:tc>

</xml_diff>